<commit_message>
feat: P003 QA test updates — Round1~5, FM dialog fixes, final report (15/15 PASS)
</commit_message>
<xml_diff>
--- a/QA/P003_QA_Report_20260406.docx
+++ b/QA/P003_QA_Report_20260406.docx
@@ -30,7 +30,7 @@
     </w:p>
     <w:p>
       <w:r>
-        <w:t>報告產生：2026-04-06 16:30</w:t>
+        <w:t>報告產生：2026-04-07 00:42</w:t>
       </w:r>
     </w:p>
     <w:p>
@@ -3704,7 +3704,15 @@
         <w:pStyle w:val="ListNumber"/>
       </w:pPr>
       <w:r>
-        <w:t>21. sidebar_tree.png (117 KB)</w:t>
+        <w:t>21. dialogs_v5 (4 KB)</w:t>
+      </w:r>
+    </w:p>
+    <w:p>
+      <w:pPr>
+        <w:pStyle w:val="ListNumber"/>
+      </w:pPr>
+      <w:r>
+        <w:t>22. sidebar_tree.png (117 KB)</w:t>
       </w:r>
     </w:p>
     <w:sectPr>

</xml_diff>